<commit_message>
feat: terminar apartado 2
</commit_message>
<xml_diff>
--- a/p1/p1.docx
+++ b/p1/p1.docx
@@ -5849,7 +5849,7 @@
                 <w:szCs w:val="20"/>
               </w:rPr>
               <w:drawing>
-                <wp:anchor behindDoc="0" distT="0" distB="0" distL="0" distR="0" simplePos="0" locked="0" layoutInCell="0" allowOverlap="1" relativeHeight="9">
+                <wp:anchor behindDoc="0" distT="0" distB="0" distL="0" distR="0" simplePos="0" locked="0" layoutInCell="1" allowOverlap="1" relativeHeight="9">
                   <wp:simplePos x="0" y="0"/>
                   <wp:positionH relativeFrom="column">
                     <wp:align>center</wp:align>
@@ -5930,7 +5930,7 @@
                 <w:szCs w:val="20"/>
               </w:rPr>
               <w:drawing>
-                <wp:anchor behindDoc="0" distT="0" distB="0" distL="0" distR="0" simplePos="0" locked="0" layoutInCell="0" allowOverlap="1" relativeHeight="8">
+                <wp:anchor behindDoc="0" distT="0" distB="0" distL="0" distR="0" simplePos="0" locked="0" layoutInCell="1" allowOverlap="1" relativeHeight="8">
                   <wp:simplePos x="0" y="0"/>
                   <wp:positionH relativeFrom="column">
                     <wp:align>center</wp:align>
@@ -6002,8 +6002,9 @@
               </w:rPr>
             </w:pPr>
             <w:r>
+              <w:rPr/>
               <w:drawing>
-                <wp:anchor behindDoc="0" distT="0" distB="0" distL="0" distR="0" simplePos="0" locked="0" layoutInCell="0" allowOverlap="1" relativeHeight="10">
+                <wp:anchor behindDoc="0" distT="0" distB="0" distL="0" distR="0" simplePos="0" locked="0" layoutInCell="1" allowOverlap="1" relativeHeight="10">
                   <wp:simplePos x="0" y="0"/>
                   <wp:positionH relativeFrom="column">
                     <wp:align>center</wp:align>
@@ -6011,7 +6012,7 @@
                   <wp:positionV relativeFrom="paragraph">
                     <wp:posOffset>635</wp:posOffset>
                   </wp:positionV>
-                  <wp:extent cx="2887345" cy="1384300"/>
+                  <wp:extent cx="2887345" cy="1582420"/>
                   <wp:effectExtent l="0" t="0" r="0" b="0"/>
                   <wp:wrapSquare wrapText="largest"/>
                   <wp:docPr id="9" name="Image9"/>
@@ -6036,7 +6037,7 @@
                         <pic:spPr bwMode="auto">
                           <a:xfrm>
                             <a:off x="0" y="0"/>
-                            <a:ext cx="2887345" cy="1384300"/>
+                            <a:ext cx="2887345" cy="1582420"/>
                           </a:xfrm>
                           <a:prstGeom prst="rect">
                             <a:avLst/>
@@ -6048,17 +6049,6 @@
                   </a:graphic>
                 </wp:anchor>
               </w:drawing>
-            </w:r>
-            <w:r>
-              <w:rPr>
-                <w:rFonts w:ascii="Consolas" w:hAnsi="Consolas"/>
-                <w:b/>
-                <w:strike/>
-                <w:color w:val="FF0000"/>
-                <w:sz w:val="18"/>
-                <w:szCs w:val="20"/>
-              </w:rPr>
-              <w:t>4</w:t>
             </w:r>
           </w:p>
         </w:tc>
@@ -6274,16 +6264,7 @@
                 <w:sz w:val="18"/>
                 <w:lang w:val="en-US"/>
               </w:rPr>
-              <w:t xml:space="preserve">echo 1 &gt; /proc/sys/net/ipv4/ip_forward </w:t>
-            </w:r>
-            <w:r>
-              <w:rPr>
-                <w:rFonts w:ascii="Consolas" w:hAnsi="Consolas"/>
-                <w:color w:val="FF0000"/>
-                <w:sz w:val="18"/>
-                <w:lang w:val="en-US"/>
-              </w:rPr>
-              <w:t># Habilitar forwarding</w:t>
+              <w:t>echo 1 &gt; /proc/sys/net/ipv4/ip_forward # Habilitar forwarding</w:t>
             </w:r>
           </w:p>
           <w:p>
@@ -6820,6 +6801,7 @@
         </w:numPr>
         <w:suppressAutoHyphens w:val="true"/>
         <w:spacing w:lineRule="auto" w:line="240" w:before="120" w:after="0"/>
+        <w:ind w:hanging="0" w:start="0"/>
         <w:jc w:val="start"/>
         <w:rPr/>
       </w:pPr>
@@ -6839,7 +6821,8 @@
           <w:numId w:val="0"/>
         </w:numPr>
         <w:suppressAutoHyphens w:val="true"/>
-        <w:spacing w:lineRule="auto" w:line="240" w:before="120" w:after="0"/>
+        <w:spacing w:lineRule="auto" w:line="240" w:before="0" w:after="0"/>
+        <w:ind w:hanging="0" w:start="0"/>
         <w:jc w:val="start"/>
         <w:outlineLvl w:val="2"/>
         <w:rPr/>
@@ -7523,7 +7506,7 @@
                     <w:szCs w:val="22"/>
                     <w:lang w:val="es-ES" w:eastAsia="en-US" w:bidi="ar-SA"/>
                   </w:rPr>
-                  <w:t>☐</w:t>
+                  <w:t>x</w:t>
                 </w:r>
               </w:p>
             </w:sdtContent>
@@ -7545,20 +7528,79 @@
               <w:jc w:val="start"/>
               <w:rPr>
                 <w:rFonts w:ascii="Consolas" w:hAnsi="Consolas"/>
-                <w:b/>
-                <w:color w:val="FF0000"/>
-                <w:sz w:val="18"/>
-                <w:u w:val="single"/>
-              </w:rPr>
-            </w:pPr>
-            <w:r>
-              <w:rPr>
-                <w:rFonts w:ascii="Consolas" w:hAnsi="Consolas"/>
-                <w:b/>
-                <w:color w:val="FF0000"/>
-                <w:sz w:val="18"/>
-                <w:u w:val="single"/>
-              </w:rPr>
+                <w:b w:val="false"/>
+                <w:bCs w:val="false"/>
+                <w:color w:val="FF0000"/>
+                <w:sz w:val="18"/>
+                <w:u w:val="none"/>
+              </w:rPr>
+            </w:pPr>
+            <w:r>
+              <w:rPr>
+                <w:rFonts w:ascii="Consolas" w:hAnsi="Consolas"/>
+                <w:b w:val="false"/>
+                <w:bCs w:val="false"/>
+                <w:color w:val="FF0000"/>
+                <w:sz w:val="18"/>
+                <w:u w:val="none"/>
+              </w:rPr>
+              <w:t>Cumple con la política: Permitir ping desde la red DMZ hacia el firewall, pero no al contrario.</w:t>
+            </w:r>
+          </w:p>
+          <w:p>
+            <w:pPr>
+              <w:pStyle w:val="Normal"/>
+              <w:widowControl/>
+              <w:suppressAutoHyphens w:val="true"/>
+              <w:spacing w:lineRule="auto" w:line="240" w:before="0" w:after="0"/>
+              <w:jc w:val="start"/>
+              <w:rPr>
+                <w:rFonts w:ascii="Consolas" w:hAnsi="Consolas"/>
+                <w:b w:val="false"/>
+                <w:bCs w:val="false"/>
+                <w:color w:val="FF0000"/>
+                <w:sz w:val="18"/>
+                <w:u w:val="none"/>
+              </w:rPr>
+            </w:pPr>
+            <w:r>
+              <w:rPr>
+                <w:rFonts w:ascii="Consolas" w:hAnsi="Consolas"/>
+                <w:b w:val="false"/>
+                <w:bCs w:val="false"/>
+                <w:color w:val="FF0000"/>
+                <w:sz w:val="18"/>
+                <w:u w:val="none"/>
+              </w:rPr>
+              <w:t>iptables -A INPUT -p icmp --icmp-type echo-request -s 192.168.56.0/24 -j ACCEPT</w:t>
+            </w:r>
+          </w:p>
+          <w:p>
+            <w:pPr>
+              <w:pStyle w:val="Normal"/>
+              <w:widowControl/>
+              <w:suppressAutoHyphens w:val="true"/>
+              <w:spacing w:lineRule="auto" w:line="240" w:before="0" w:after="0"/>
+              <w:jc w:val="start"/>
+              <w:rPr>
+                <w:rFonts w:ascii="Consolas" w:hAnsi="Consolas"/>
+                <w:b w:val="false"/>
+                <w:bCs w:val="false"/>
+                <w:color w:val="FF0000"/>
+                <w:sz w:val="18"/>
+                <w:u w:val="none"/>
+              </w:rPr>
+            </w:pPr>
+            <w:r>
+              <w:rPr>
+                <w:rFonts w:ascii="Consolas" w:hAnsi="Consolas"/>
+                <w:b w:val="false"/>
+                <w:bCs w:val="false"/>
+                <w:color w:val="FF0000"/>
+                <w:sz w:val="18"/>
+                <w:u w:val="none"/>
+              </w:rPr>
+              <w:t>iptables -A OUTPUT -p icmp --icmp-type echo-reply -d 192.168.56.0/24 -j ACCEPT</w:t>
             </w:r>
           </w:p>
         </w:tc>
@@ -7718,7 +7760,7 @@
                     <w:szCs w:val="22"/>
                     <w:lang w:val="es-ES" w:eastAsia="en-US" w:bidi="ar-SA"/>
                   </w:rPr>
-                  <w:t>☐</w:t>
+                  <w:t>x</w:t>
                 </w:r>
               </w:p>
             </w:sdtContent>
@@ -7738,20 +7780,79 @@
               <w:jc w:val="start"/>
               <w:rPr>
                 <w:rFonts w:ascii="Consolas" w:hAnsi="Consolas"/>
-                <w:b/>
-                <w:color w:val="FF0000"/>
-                <w:sz w:val="18"/>
-                <w:u w:val="single"/>
-              </w:rPr>
-            </w:pPr>
-            <w:r>
-              <w:rPr>
-                <w:rFonts w:ascii="Consolas" w:hAnsi="Consolas"/>
-                <w:b/>
-                <w:color w:val="FF0000"/>
-                <w:sz w:val="18"/>
-                <w:u w:val="single"/>
-              </w:rPr>
+                <w:b w:val="false"/>
+                <w:bCs w:val="false"/>
+                <w:color w:val="FF0000"/>
+                <w:sz w:val="18"/>
+                <w:u w:val="none"/>
+              </w:rPr>
+            </w:pPr>
+            <w:r>
+              <w:rPr>
+                <w:rFonts w:ascii="Consolas" w:hAnsi="Consolas"/>
+                <w:b w:val="false"/>
+                <w:bCs w:val="false"/>
+                <w:color w:val="FF0000"/>
+                <w:sz w:val="18"/>
+                <w:u w:val="none"/>
+              </w:rPr>
+              <w:t>Cumple con la política: Permitir ping desde la red DMZ hacia el firewall, pero no al contrario.</w:t>
+            </w:r>
+          </w:p>
+          <w:p>
+            <w:pPr>
+              <w:pStyle w:val="Normal"/>
+              <w:widowControl/>
+              <w:suppressAutoHyphens w:val="true"/>
+              <w:spacing w:lineRule="auto" w:line="240" w:before="0" w:after="0"/>
+              <w:jc w:val="start"/>
+              <w:rPr>
+                <w:rFonts w:ascii="Consolas" w:hAnsi="Consolas"/>
+                <w:b w:val="false"/>
+                <w:bCs w:val="false"/>
+                <w:color w:val="FF0000"/>
+                <w:sz w:val="18"/>
+                <w:u w:val="none"/>
+              </w:rPr>
+            </w:pPr>
+            <w:r>
+              <w:rPr>
+                <w:rFonts w:ascii="Consolas" w:hAnsi="Consolas"/>
+                <w:b w:val="false"/>
+                <w:bCs w:val="false"/>
+                <w:color w:val="FF0000"/>
+                <w:sz w:val="18"/>
+                <w:u w:val="none"/>
+              </w:rPr>
+              <w:t>iptables -A INPUT -p icmp --icmp-type echo-request -s 192.168.56.0/24 -j ACCEPT</w:t>
+            </w:r>
+          </w:p>
+          <w:p>
+            <w:pPr>
+              <w:pStyle w:val="Normal"/>
+              <w:widowControl/>
+              <w:suppressAutoHyphens w:val="true"/>
+              <w:spacing w:lineRule="auto" w:line="240" w:before="0" w:after="0"/>
+              <w:jc w:val="start"/>
+              <w:rPr>
+                <w:rFonts w:ascii="Consolas" w:hAnsi="Consolas"/>
+                <w:b w:val="false"/>
+                <w:bCs w:val="false"/>
+                <w:color w:val="FF0000"/>
+                <w:sz w:val="18"/>
+                <w:u w:val="none"/>
+              </w:rPr>
+            </w:pPr>
+            <w:r>
+              <w:rPr>
+                <w:rFonts w:ascii="Consolas" w:hAnsi="Consolas"/>
+                <w:b w:val="false"/>
+                <w:bCs w:val="false"/>
+                <w:color w:val="FF0000"/>
+                <w:sz w:val="18"/>
+                <w:u w:val="none"/>
+              </w:rPr>
+              <w:t>iptables -A OUTPUT -p icmp --icmp-type echo-reply -d 192.168.56.0/24 -j ACCEPT</w:t>
             </w:r>
           </w:p>
         </w:tc>
@@ -7931,20 +8032,110 @@
               <w:jc w:val="start"/>
               <w:rPr>
                 <w:rFonts w:ascii="Consolas" w:hAnsi="Consolas"/>
-                <w:b/>
-                <w:color w:val="FF0000"/>
-                <w:sz w:val="18"/>
-                <w:u w:val="single"/>
-              </w:rPr>
-            </w:pPr>
-            <w:r>
-              <w:rPr>
-                <w:rFonts w:ascii="Consolas" w:hAnsi="Consolas"/>
-                <w:b/>
-                <w:color w:val="FF0000"/>
-                <w:sz w:val="18"/>
-                <w:u w:val="single"/>
-              </w:rPr>
+                <w:b w:val="false"/>
+                <w:bCs w:val="false"/>
+                <w:color w:val="FF0000"/>
+                <w:sz w:val="18"/>
+                <w:u w:val="none"/>
+              </w:rPr>
+            </w:pPr>
+            <w:r>
+              <w:rPr>
+                <w:rFonts w:ascii="Consolas" w:hAnsi="Consolas"/>
+                <w:b w:val="false"/>
+                <w:bCs w:val="false"/>
+                <w:color w:val="FF0000"/>
+                <w:sz w:val="18"/>
+                <w:u w:val="none"/>
+              </w:rPr>
+              <w:t>Cumple con la política: Permitir ping desde la LAN hacia la DMZ, pero no al contrario.</w:t>
+            </w:r>
+          </w:p>
+          <w:p>
+            <w:pPr>
+              <w:pStyle w:val="Normal"/>
+              <w:widowControl/>
+              <w:suppressAutoHyphens w:val="true"/>
+              <w:bidi w:val="0"/>
+              <w:spacing w:lineRule="auto" w:line="240" w:before="0" w:after="0"/>
+              <w:jc w:val="start"/>
+              <w:rPr>
+                <w:rFonts w:ascii="Consolas" w:hAnsi="Consolas"/>
+                <w:b w:val="false"/>
+                <w:bCs w:val="false"/>
+                <w:color w:val="FF0000"/>
+                <w:sz w:val="18"/>
+                <w:u w:val="none"/>
+              </w:rPr>
+            </w:pPr>
+            <w:r>
+              <w:rPr>
+                <w:rFonts w:ascii="Consolas" w:hAnsi="Consolas"/>
+                <w:b w:val="false"/>
+                <w:bCs w:val="false"/>
+                <w:color w:val="FF0000"/>
+                <w:sz w:val="18"/>
+                <w:u w:val="none"/>
+              </w:rPr>
+              <w:t>iptables -A FORWARD -p icmp --icmp-type echo-request -s 192.168.57.0/24 -d 192.168.56.0/24 -j ACCEPT</w:t>
+            </w:r>
+          </w:p>
+          <w:p>
+            <w:pPr>
+              <w:pStyle w:val="Normal"/>
+              <w:widowControl/>
+              <w:suppressAutoHyphens w:val="true"/>
+              <w:bidi w:val="0"/>
+              <w:spacing w:lineRule="auto" w:line="240" w:before="0" w:after="0"/>
+              <w:jc w:val="start"/>
+              <w:rPr>
+                <w:rFonts w:ascii="Consolas" w:hAnsi="Consolas"/>
+                <w:b w:val="false"/>
+                <w:bCs w:val="false"/>
+                <w:color w:val="FF0000"/>
+                <w:sz w:val="18"/>
+                <w:u w:val="none"/>
+              </w:rPr>
+            </w:pPr>
+            <w:r>
+              <w:rPr>
+                <w:rFonts w:ascii="Consolas" w:hAnsi="Consolas"/>
+                <w:b w:val="false"/>
+                <w:bCs w:val="false"/>
+                <w:color w:val="FF0000"/>
+                <w:sz w:val="18"/>
+                <w:u w:val="none"/>
+              </w:rPr>
+              <w:t>iptables -A FORWARD -p icmp --icmp-type echo-reply -s 192.168.56.0/24 -d 192.168.57.0/24 -j ACCEPT</w:t>
+            </w:r>
+          </w:p>
+          <w:p>
+            <w:pPr>
+              <w:pStyle w:val="Normal"/>
+              <w:widowControl/>
+              <w:suppressAutoHyphens w:val="true"/>
+              <w:bidi w:val="0"/>
+              <w:spacing w:lineRule="auto" w:line="240" w:before="0" w:after="0"/>
+              <w:jc w:val="start"/>
+              <w:rPr>
+                <w:rFonts w:ascii="Consolas" w:hAnsi="Consolas"/>
+                <w:b w:val="false"/>
+                <w:bCs w:val="false"/>
+                <w:color w:val="FF0000"/>
+                <w:sz w:val="18"/>
+                <w:u w:val="none"/>
+              </w:rPr>
+            </w:pPr>
+            <w:r>
+              <w:rPr>
+                <w:rFonts w:ascii="Consolas" w:hAnsi="Consolas"/>
+                <w:b w:val="false"/>
+                <w:bCs w:val="false"/>
+                <w:color w:val="FF0000"/>
+                <w:sz w:val="18"/>
+                <w:u w:val="none"/>
+              </w:rPr>
+              <w:t>(Es decir, cae en la política deny default)</w:t>
             </w:r>
           </w:p>
         </w:tc>
@@ -8125,20 +8316,108 @@
               <w:jc w:val="start"/>
               <w:rPr>
                 <w:rFonts w:ascii="Consolas" w:hAnsi="Consolas"/>
-                <w:b/>
-                <w:color w:val="FF0000"/>
-                <w:sz w:val="18"/>
-                <w:u w:val="single"/>
-              </w:rPr>
-            </w:pPr>
-            <w:r>
-              <w:rPr>
-                <w:rFonts w:ascii="Consolas" w:hAnsi="Consolas"/>
-                <w:b/>
-                <w:color w:val="FF0000"/>
-                <w:sz w:val="18"/>
-                <w:u w:val="single"/>
-              </w:rPr>
+                <w:b w:val="false"/>
+                <w:bCs w:val="false"/>
+                <w:color w:val="FF0000"/>
+                <w:sz w:val="18"/>
+                <w:u w:val="none"/>
+              </w:rPr>
+            </w:pPr>
+            <w:r>
+              <w:rPr>
+                <w:rFonts w:ascii="Consolas" w:hAnsi="Consolas"/>
+                <w:b w:val="false"/>
+                <w:bCs w:val="false"/>
+                <w:color w:val="FF0000"/>
+                <w:sz w:val="18"/>
+                <w:u w:val="none"/>
+              </w:rPr>
+              <w:t>Cumple con la política: Permitir ping desde la red DMZ hacia el firewall, pero no al contrario.</w:t>
+            </w:r>
+          </w:p>
+          <w:p>
+            <w:pPr>
+              <w:pStyle w:val="Normal"/>
+              <w:widowControl/>
+              <w:suppressAutoHyphens w:val="true"/>
+              <w:spacing w:lineRule="auto" w:line="240" w:before="0" w:after="0"/>
+              <w:jc w:val="start"/>
+              <w:rPr>
+                <w:rFonts w:ascii="Consolas" w:hAnsi="Consolas"/>
+                <w:b w:val="false"/>
+                <w:bCs w:val="false"/>
+                <w:color w:val="FF0000"/>
+                <w:sz w:val="18"/>
+                <w:u w:val="none"/>
+              </w:rPr>
+            </w:pPr>
+            <w:r>
+              <w:rPr>
+                <w:rFonts w:ascii="Consolas" w:hAnsi="Consolas"/>
+                <w:b w:val="false"/>
+                <w:bCs w:val="false"/>
+                <w:color w:val="FF0000"/>
+                <w:sz w:val="18"/>
+                <w:u w:val="none"/>
+              </w:rPr>
+              <w:t>iptables -A INPUT -p icmp --icmp-type echo-request -s 192.168.56.0/24 -j ACCEPT</w:t>
+            </w:r>
+          </w:p>
+          <w:p>
+            <w:pPr>
+              <w:pStyle w:val="Normal"/>
+              <w:widowControl/>
+              <w:suppressAutoHyphens w:val="true"/>
+              <w:spacing w:lineRule="auto" w:line="240" w:before="0" w:after="0"/>
+              <w:jc w:val="start"/>
+              <w:rPr>
+                <w:rFonts w:ascii="Consolas" w:hAnsi="Consolas"/>
+                <w:b w:val="false"/>
+                <w:bCs w:val="false"/>
+                <w:color w:val="FF0000"/>
+                <w:sz w:val="18"/>
+                <w:u w:val="none"/>
+              </w:rPr>
+            </w:pPr>
+            <w:r>
+              <w:rPr>
+                <w:rFonts w:ascii="Consolas" w:hAnsi="Consolas"/>
+                <w:b w:val="false"/>
+                <w:bCs w:val="false"/>
+                <w:color w:val="FF0000"/>
+                <w:sz w:val="18"/>
+                <w:u w:val="none"/>
+              </w:rPr>
+              <w:t>iptables -A OUTPUT -p icmp --icmp-type echo-reply -d 192.168.56.0/24 -j ACCEPT</w:t>
+            </w:r>
+          </w:p>
+          <w:p>
+            <w:pPr>
+              <w:pStyle w:val="Normal"/>
+              <w:widowControl/>
+              <w:suppressAutoHyphens w:val="true"/>
+              <w:bidi w:val="0"/>
+              <w:spacing w:lineRule="auto" w:line="240" w:before="0" w:after="0"/>
+              <w:jc w:val="start"/>
+              <w:rPr>
+                <w:rFonts w:ascii="Consolas" w:hAnsi="Consolas"/>
+                <w:b w:val="false"/>
+                <w:bCs w:val="false"/>
+                <w:color w:val="FF0000"/>
+                <w:sz w:val="18"/>
+                <w:u w:val="none"/>
+              </w:rPr>
+            </w:pPr>
+            <w:r>
+              <w:rPr>
+                <w:rFonts w:ascii="Consolas" w:hAnsi="Consolas"/>
+                <w:b w:val="false"/>
+                <w:bCs w:val="false"/>
+                <w:color w:val="FF0000"/>
+                <w:sz w:val="18"/>
+                <w:u w:val="none"/>
+              </w:rPr>
+              <w:t>(Es decir, cae en la política deny default)</w:t>
             </w:r>
           </w:p>
         </w:tc>
@@ -8318,20 +8597,107 @@
               <w:jc w:val="start"/>
               <w:rPr>
                 <w:rFonts w:ascii="Consolas" w:hAnsi="Consolas"/>
-                <w:b/>
-                <w:color w:val="FF0000"/>
-                <w:sz w:val="18"/>
-                <w:u w:val="single"/>
-              </w:rPr>
-            </w:pPr>
-            <w:r>
-              <w:rPr>
-                <w:rFonts w:ascii="Consolas" w:hAnsi="Consolas"/>
-                <w:b/>
-                <w:color w:val="FF0000"/>
-                <w:sz w:val="18"/>
-                <w:u w:val="single"/>
-              </w:rPr>
+                <w:b w:val="false"/>
+                <w:bCs w:val="false"/>
+                <w:color w:val="FF0000"/>
+                <w:sz w:val="18"/>
+                <w:u w:val="none"/>
+              </w:rPr>
+            </w:pPr>
+            <w:r>
+              <w:rPr>
+                <w:rFonts w:ascii="Consolas" w:hAnsi="Consolas"/>
+                <w:b w:val="false"/>
+                <w:bCs w:val="false"/>
+                <w:color w:val="FF0000"/>
+                <w:sz w:val="18"/>
+                <w:u w:val="none"/>
+              </w:rPr>
+              <w:t>Cumple con la política restrictiva.</w:t>
+            </w:r>
+          </w:p>
+          <w:p>
+            <w:pPr>
+              <w:pStyle w:val="Normal"/>
+              <w:widowControl/>
+              <w:suppressAutoHyphens w:val="true"/>
+              <w:spacing w:lineRule="auto" w:line="240" w:before="0" w:after="0"/>
+              <w:jc w:val="start"/>
+              <w:rPr>
+                <w:rFonts w:ascii="Consolas" w:hAnsi="Consolas"/>
+                <w:b w:val="false"/>
+                <w:bCs w:val="false"/>
+                <w:color w:val="FF0000"/>
+                <w:sz w:val="18"/>
+                <w:u w:val="none"/>
+              </w:rPr>
+            </w:pPr>
+            <w:r>
+              <w:rPr>
+                <w:rFonts w:ascii="Consolas" w:hAnsi="Consolas"/>
+                <w:b w:val="false"/>
+                <w:bCs w:val="false"/>
+                <w:color w:val="FF0000"/>
+                <w:sz w:val="18"/>
+                <w:u w:val="none"/>
+              </w:rPr>
+              <w:t>iptables -P INPUT DROP</w:t>
+            </w:r>
+          </w:p>
+          <w:p>
+            <w:pPr>
+              <w:pStyle w:val="Normal"/>
+              <w:widowControl/>
+              <w:suppressAutoHyphens w:val="true"/>
+              <w:spacing w:lineRule="auto" w:line="240" w:before="0" w:after="0"/>
+              <w:jc w:val="start"/>
+              <w:rPr>
+                <w:rFonts w:ascii="Consolas" w:hAnsi="Consolas"/>
+                <w:b w:val="false"/>
+                <w:bCs w:val="false"/>
+                <w:color w:val="FF0000"/>
+                <w:sz w:val="18"/>
+                <w:u w:val="none"/>
+              </w:rPr>
+            </w:pPr>
+            <w:r>
+              <w:rPr>
+                <w:rFonts w:ascii="Consolas" w:hAnsi="Consolas"/>
+                <w:b w:val="false"/>
+                <w:bCs w:val="false"/>
+                <w:color w:val="FF0000"/>
+                <w:sz w:val="18"/>
+                <w:u w:val="none"/>
+              </w:rPr>
+              <w:t>iptables -P OUTPUT DROP</w:t>
+            </w:r>
+          </w:p>
+          <w:p>
+            <w:pPr>
+              <w:pStyle w:val="Normal"/>
+              <w:widowControl/>
+              <w:suppressAutoHyphens w:val="true"/>
+              <w:spacing w:lineRule="auto" w:line="240" w:before="0" w:after="0"/>
+              <w:jc w:val="start"/>
+              <w:rPr>
+                <w:rFonts w:ascii="Consolas" w:hAnsi="Consolas"/>
+                <w:b w:val="false"/>
+                <w:bCs w:val="false"/>
+                <w:color w:val="FF0000"/>
+                <w:sz w:val="18"/>
+                <w:u w:val="none"/>
+              </w:rPr>
+            </w:pPr>
+            <w:r>
+              <w:rPr>
+                <w:rFonts w:ascii="Consolas" w:hAnsi="Consolas"/>
+                <w:b w:val="false"/>
+                <w:bCs w:val="false"/>
+                <w:color w:val="FF0000"/>
+                <w:sz w:val="18"/>
+                <w:u w:val="none"/>
+              </w:rPr>
+              <w:t>iptables -P FORWARD DROP</w:t>
             </w:r>
           </w:p>
         </w:tc>
@@ -8518,20 +8884,107 @@
               <w:jc w:val="start"/>
               <w:rPr>
                 <w:rFonts w:ascii="Consolas" w:hAnsi="Consolas"/>
-                <w:b/>
-                <w:color w:val="FF0000"/>
-                <w:sz w:val="18"/>
-                <w:u w:val="single"/>
-              </w:rPr>
-            </w:pPr>
-            <w:r>
-              <w:rPr>
-                <w:rFonts w:ascii="Consolas" w:hAnsi="Consolas"/>
-                <w:b/>
-                <w:color w:val="FF0000"/>
-                <w:sz w:val="18"/>
-                <w:u w:val="single"/>
-              </w:rPr>
+                <w:b w:val="false"/>
+                <w:bCs w:val="false"/>
+                <w:color w:val="FF0000"/>
+                <w:sz w:val="18"/>
+                <w:u w:val="none"/>
+              </w:rPr>
+            </w:pPr>
+            <w:r>
+              <w:rPr>
+                <w:rFonts w:ascii="Consolas" w:hAnsi="Consolas"/>
+                <w:b w:val="false"/>
+                <w:bCs w:val="false"/>
+                <w:color w:val="FF0000"/>
+                <w:sz w:val="18"/>
+                <w:u w:val="none"/>
+              </w:rPr>
+              <w:t>Cumple con la política restrictiva.</w:t>
+            </w:r>
+          </w:p>
+          <w:p>
+            <w:pPr>
+              <w:pStyle w:val="Normal"/>
+              <w:widowControl/>
+              <w:suppressAutoHyphens w:val="true"/>
+              <w:spacing w:lineRule="auto" w:line="240" w:before="0" w:after="0"/>
+              <w:jc w:val="start"/>
+              <w:rPr>
+                <w:rFonts w:ascii="Consolas" w:hAnsi="Consolas"/>
+                <w:b w:val="false"/>
+                <w:bCs w:val="false"/>
+                <w:color w:val="FF0000"/>
+                <w:sz w:val="18"/>
+                <w:u w:val="none"/>
+              </w:rPr>
+            </w:pPr>
+            <w:r>
+              <w:rPr>
+                <w:rFonts w:ascii="Consolas" w:hAnsi="Consolas"/>
+                <w:b w:val="false"/>
+                <w:bCs w:val="false"/>
+                <w:color w:val="FF0000"/>
+                <w:sz w:val="18"/>
+                <w:u w:val="none"/>
+              </w:rPr>
+              <w:t>iptables -P INPUT DROP</w:t>
+            </w:r>
+          </w:p>
+          <w:p>
+            <w:pPr>
+              <w:pStyle w:val="Normal"/>
+              <w:widowControl/>
+              <w:suppressAutoHyphens w:val="true"/>
+              <w:spacing w:lineRule="auto" w:line="240" w:before="0" w:after="0"/>
+              <w:jc w:val="start"/>
+              <w:rPr>
+                <w:rFonts w:ascii="Consolas" w:hAnsi="Consolas"/>
+                <w:b w:val="false"/>
+                <w:bCs w:val="false"/>
+                <w:color w:val="FF0000"/>
+                <w:sz w:val="18"/>
+                <w:u w:val="none"/>
+              </w:rPr>
+            </w:pPr>
+            <w:r>
+              <w:rPr>
+                <w:rFonts w:ascii="Consolas" w:hAnsi="Consolas"/>
+                <w:b w:val="false"/>
+                <w:bCs w:val="false"/>
+                <w:color w:val="FF0000"/>
+                <w:sz w:val="18"/>
+                <w:u w:val="none"/>
+              </w:rPr>
+              <w:t>iptables -P OUTPUT DROP</w:t>
+            </w:r>
+          </w:p>
+          <w:p>
+            <w:pPr>
+              <w:pStyle w:val="Normal"/>
+              <w:widowControl/>
+              <w:suppressAutoHyphens w:val="true"/>
+              <w:spacing w:lineRule="auto" w:line="240" w:before="0" w:after="0"/>
+              <w:jc w:val="start"/>
+              <w:rPr>
+                <w:rFonts w:ascii="Consolas" w:hAnsi="Consolas"/>
+                <w:b w:val="false"/>
+                <w:bCs w:val="false"/>
+                <w:color w:val="FF0000"/>
+                <w:sz w:val="18"/>
+                <w:u w:val="none"/>
+              </w:rPr>
+            </w:pPr>
+            <w:r>
+              <w:rPr>
+                <w:rFonts w:ascii="Consolas" w:hAnsi="Consolas"/>
+                <w:b w:val="false"/>
+                <w:bCs w:val="false"/>
+                <w:color w:val="FF0000"/>
+                <w:sz w:val="18"/>
+                <w:u w:val="none"/>
+              </w:rPr>
+              <w:t>iptables -P FORWARD DROP</w:t>
             </w:r>
           </w:p>
         </w:tc>
@@ -8718,19 +9171,133 @@
               <w:jc w:val="start"/>
               <w:rPr>
                 <w:rFonts w:ascii="Consolas" w:hAnsi="Consolas"/>
-                <w:b/>
-                <w:color w:val="FF0000"/>
-                <w:sz w:val="18"/>
-                <w:u w:val="single"/>
-              </w:rPr>
-            </w:pPr>
-            <w:r>
-              <w:rPr>
-                <w:rFonts w:ascii="Consolas" w:hAnsi="Consolas"/>
-                <w:b/>
-                <w:color w:val="FF0000"/>
-                <w:sz w:val="18"/>
-                <w:u w:val="single"/>
+                <w:b w:val="false"/>
+                <w:bCs w:val="false"/>
+                <w:color w:val="FF0000"/>
+                <w:sz w:val="18"/>
+                <w:u w:val="none"/>
+              </w:rPr>
+            </w:pPr>
+            <w:r>
+              <w:rPr>
+                <w:rFonts w:ascii="Consolas" w:hAnsi="Consolas"/>
+                <w:b w:val="false"/>
+                <w:bCs w:val="false"/>
+                <w:color w:val="FF0000"/>
+                <w:sz w:val="18"/>
+                <w:u w:val="none"/>
+              </w:rPr>
+              <w:t>Cumple con la política restrictiva.</w:t>
+            </w:r>
+          </w:p>
+          <w:p>
+            <w:pPr>
+              <w:pStyle w:val="Normal"/>
+              <w:widowControl/>
+              <w:suppressAutoHyphens w:val="true"/>
+              <w:spacing w:lineRule="auto" w:line="240" w:before="0" w:after="0"/>
+              <w:jc w:val="start"/>
+              <w:rPr>
+                <w:rFonts w:ascii="Consolas" w:hAnsi="Consolas"/>
+                <w:b w:val="false"/>
+                <w:bCs w:val="false"/>
+                <w:color w:val="FF0000"/>
+                <w:sz w:val="18"/>
+                <w:u w:val="none"/>
+              </w:rPr>
+            </w:pPr>
+            <w:r>
+              <w:rPr>
+                <w:rFonts w:ascii="Consolas" w:hAnsi="Consolas"/>
+                <w:b w:val="false"/>
+                <w:bCs w:val="false"/>
+                <w:color w:val="FF0000"/>
+                <w:sz w:val="18"/>
+                <w:u w:val="none"/>
+              </w:rPr>
+              <w:t>iptables -P INPUT DROP</w:t>
+            </w:r>
+          </w:p>
+          <w:p>
+            <w:pPr>
+              <w:pStyle w:val="Normal"/>
+              <w:widowControl/>
+              <w:suppressAutoHyphens w:val="true"/>
+              <w:spacing w:lineRule="auto" w:line="240" w:before="0" w:after="0"/>
+              <w:jc w:val="start"/>
+              <w:rPr>
+                <w:rFonts w:ascii="Consolas" w:hAnsi="Consolas"/>
+                <w:b w:val="false"/>
+                <w:bCs w:val="false"/>
+                <w:color w:val="FF0000"/>
+                <w:sz w:val="18"/>
+                <w:u w:val="none"/>
+              </w:rPr>
+            </w:pPr>
+            <w:r>
+              <w:rPr>
+                <w:rFonts w:ascii="Consolas" w:hAnsi="Consolas"/>
+                <w:b w:val="false"/>
+                <w:bCs w:val="false"/>
+                <w:color w:val="FF0000"/>
+                <w:sz w:val="18"/>
+                <w:u w:val="none"/>
+              </w:rPr>
+              <w:t>iptables -P OUTPUT DROP</w:t>
+            </w:r>
+          </w:p>
+          <w:p>
+            <w:pPr>
+              <w:pStyle w:val="Normal"/>
+              <w:widowControl/>
+              <w:suppressAutoHyphens w:val="true"/>
+              <w:spacing w:lineRule="auto" w:line="240" w:before="0" w:after="0"/>
+              <w:jc w:val="start"/>
+              <w:rPr>
+                <w:rFonts w:ascii="Consolas" w:hAnsi="Consolas"/>
+                <w:b w:val="false"/>
+                <w:bCs w:val="false"/>
+                <w:color w:val="FF0000"/>
+                <w:sz w:val="18"/>
+                <w:u w:val="none"/>
+              </w:rPr>
+            </w:pPr>
+            <w:r>
+              <w:rPr>
+                <w:rFonts w:ascii="Consolas" w:hAnsi="Consolas"/>
+                <w:b w:val="false"/>
+                <w:bCs w:val="false"/>
+                <w:color w:val="FF0000"/>
+                <w:sz w:val="18"/>
+                <w:u w:val="none"/>
+              </w:rPr>
+              <w:t>iptables -P FORWARD DROP</w:t>
+            </w:r>
+          </w:p>
+          <w:p>
+            <w:pPr>
+              <w:pStyle w:val="Normal"/>
+              <w:widowControl/>
+              <w:suppressAutoHyphens w:val="true"/>
+              <w:spacing w:lineRule="auto" w:line="240" w:before="0" w:after="0"/>
+              <w:jc w:val="start"/>
+              <w:rPr>
+                <w:rFonts w:ascii="Consolas" w:hAnsi="Consolas"/>
+                <w:b w:val="false"/>
+                <w:bCs w:val="false"/>
+                <w:color w:val="FF0000"/>
+                <w:sz w:val="18"/>
+                <w:u w:val="none"/>
+              </w:rPr>
+            </w:pPr>
+            <w:r>
+              <w:rPr>
+                <w:rFonts w:ascii="Consolas" w:hAnsi="Consolas"/>
+                <w:b w:val="false"/>
+                <w:bCs w:val="false"/>
+                <w:color w:val="FF0000"/>
+                <w:sz w:val="18"/>
+                <w:u w:val="none"/>
               </w:rPr>
             </w:r>
           </w:p>
@@ -8907,7 +9474,7 @@
                     <w:szCs w:val="22"/>
                     <w:lang w:val="es-ES" w:eastAsia="en-US" w:bidi="ar-SA"/>
                   </w:rPr>
-                  <w:t>☐</w:t>
+                  <w:t>x</w:t>
                 </w:r>
               </w:p>
             </w:sdtContent>
@@ -8930,20 +9497,81 @@
               <w:jc w:val="start"/>
               <w:rPr>
                 <w:rFonts w:ascii="Consolas" w:hAnsi="Consolas"/>
-                <w:b/>
-                <w:color w:val="FF0000"/>
-                <w:sz w:val="18"/>
-                <w:u w:val="single"/>
-              </w:rPr>
-            </w:pPr>
-            <w:r>
-              <w:rPr>
-                <w:rFonts w:ascii="Consolas" w:hAnsi="Consolas"/>
-                <w:b/>
-                <w:color w:val="FF0000"/>
-                <w:sz w:val="18"/>
-                <w:u w:val="single"/>
-              </w:rPr>
+                <w:b w:val="false"/>
+                <w:bCs w:val="false"/>
+                <w:color w:val="FF0000"/>
+                <w:sz w:val="18"/>
+                <w:u w:val="none"/>
+              </w:rPr>
+            </w:pPr>
+            <w:r>
+              <w:rPr>
+                <w:rFonts w:ascii="Consolas" w:hAnsi="Consolas"/>
+                <w:b w:val="false"/>
+                <w:bCs w:val="false"/>
+                <w:color w:val="FF0000"/>
+                <w:sz w:val="18"/>
+                <w:u w:val="none"/>
+              </w:rPr>
+              <w:t>Cumple con la política: Permitir ping desde la LAN hacia la DMZ, pero no al contrario.</w:t>
+            </w:r>
+          </w:p>
+          <w:p>
+            <w:pPr>
+              <w:pStyle w:val="Normal"/>
+              <w:widowControl/>
+              <w:suppressAutoHyphens w:val="true"/>
+              <w:bidi w:val="0"/>
+              <w:spacing w:lineRule="auto" w:line="240" w:before="0" w:after="0"/>
+              <w:jc w:val="start"/>
+              <w:rPr>
+                <w:rFonts w:ascii="Consolas" w:hAnsi="Consolas"/>
+                <w:b w:val="false"/>
+                <w:bCs w:val="false"/>
+                <w:color w:val="FF0000"/>
+                <w:sz w:val="18"/>
+                <w:u w:val="none"/>
+              </w:rPr>
+            </w:pPr>
+            <w:r>
+              <w:rPr>
+                <w:rFonts w:ascii="Consolas" w:hAnsi="Consolas"/>
+                <w:b w:val="false"/>
+                <w:bCs w:val="false"/>
+                <w:color w:val="FF0000"/>
+                <w:sz w:val="18"/>
+                <w:u w:val="none"/>
+              </w:rPr>
+              <w:t>iptables -A FORWARD -p icmp --icmp-type echo-request -s 192.168.57.0/24 -d 192.168.56.0/24 -j ACCEPT</w:t>
+            </w:r>
+          </w:p>
+          <w:p>
+            <w:pPr>
+              <w:pStyle w:val="Normal"/>
+              <w:widowControl/>
+              <w:suppressAutoHyphens w:val="true"/>
+              <w:bidi w:val="0"/>
+              <w:spacing w:lineRule="auto" w:line="240" w:before="0" w:after="0"/>
+              <w:jc w:val="start"/>
+              <w:rPr>
+                <w:rFonts w:ascii="Consolas" w:hAnsi="Consolas"/>
+                <w:b w:val="false"/>
+                <w:bCs w:val="false"/>
+                <w:color w:val="FF0000"/>
+                <w:sz w:val="18"/>
+                <w:u w:val="none"/>
+              </w:rPr>
+            </w:pPr>
+            <w:r>
+              <w:rPr>
+                <w:rFonts w:ascii="Consolas" w:hAnsi="Consolas"/>
+                <w:b w:val="false"/>
+                <w:bCs w:val="false"/>
+                <w:color w:val="FF0000"/>
+                <w:sz w:val="18"/>
+                <w:u w:val="none"/>
+              </w:rPr>
+              <w:t>iptables -A FORWARD -p icmp --icmp-type echo-reply -s 192.168.56.0/24 -d 192.168.57.0/24 -j ACCEPT</w:t>
             </w:r>
           </w:p>
         </w:tc>
@@ -9141,20 +9769,107 @@
               <w:jc w:val="start"/>
               <w:rPr>
                 <w:rFonts w:ascii="Consolas" w:hAnsi="Consolas"/>
-                <w:b/>
-                <w:color w:val="FF0000"/>
-                <w:sz w:val="18"/>
-                <w:u w:val="single"/>
-              </w:rPr>
-            </w:pPr>
-            <w:r>
-              <w:rPr>
-                <w:rFonts w:ascii="Consolas" w:hAnsi="Consolas"/>
-                <w:b/>
-                <w:color w:val="FF0000"/>
-                <w:sz w:val="18"/>
-                <w:u w:val="single"/>
-              </w:rPr>
+                <w:b w:val="false"/>
+                <w:bCs w:val="false"/>
+                <w:color w:val="FF0000"/>
+                <w:sz w:val="18"/>
+                <w:u w:val="none"/>
+              </w:rPr>
+            </w:pPr>
+            <w:r>
+              <w:rPr>
+                <w:rFonts w:ascii="Consolas" w:hAnsi="Consolas"/>
+                <w:b w:val="false"/>
+                <w:bCs w:val="false"/>
+                <w:color w:val="FF0000"/>
+                <w:sz w:val="18"/>
+                <w:u w:val="none"/>
+              </w:rPr>
+              <w:t>Cumple con la política restrictiva.</w:t>
+            </w:r>
+          </w:p>
+          <w:p>
+            <w:pPr>
+              <w:pStyle w:val="Normal"/>
+              <w:widowControl/>
+              <w:suppressAutoHyphens w:val="true"/>
+              <w:spacing w:lineRule="auto" w:line="240" w:before="0" w:after="0"/>
+              <w:jc w:val="start"/>
+              <w:rPr>
+                <w:rFonts w:ascii="Consolas" w:hAnsi="Consolas"/>
+                <w:b w:val="false"/>
+                <w:bCs w:val="false"/>
+                <w:color w:val="FF0000"/>
+                <w:sz w:val="18"/>
+                <w:u w:val="none"/>
+              </w:rPr>
+            </w:pPr>
+            <w:r>
+              <w:rPr>
+                <w:rFonts w:ascii="Consolas" w:hAnsi="Consolas"/>
+                <w:b w:val="false"/>
+                <w:bCs w:val="false"/>
+                <w:color w:val="FF0000"/>
+                <w:sz w:val="18"/>
+                <w:u w:val="none"/>
+              </w:rPr>
+              <w:t>iptables -P INPUT DROP</w:t>
+            </w:r>
+          </w:p>
+          <w:p>
+            <w:pPr>
+              <w:pStyle w:val="Normal"/>
+              <w:widowControl/>
+              <w:suppressAutoHyphens w:val="true"/>
+              <w:spacing w:lineRule="auto" w:line="240" w:before="0" w:after="0"/>
+              <w:jc w:val="start"/>
+              <w:rPr>
+                <w:rFonts w:ascii="Consolas" w:hAnsi="Consolas"/>
+                <w:b w:val="false"/>
+                <w:bCs w:val="false"/>
+                <w:color w:val="FF0000"/>
+                <w:sz w:val="18"/>
+                <w:u w:val="none"/>
+              </w:rPr>
+            </w:pPr>
+            <w:r>
+              <w:rPr>
+                <w:rFonts w:ascii="Consolas" w:hAnsi="Consolas"/>
+                <w:b w:val="false"/>
+                <w:bCs w:val="false"/>
+                <w:color w:val="FF0000"/>
+                <w:sz w:val="18"/>
+                <w:u w:val="none"/>
+              </w:rPr>
+              <w:t>iptables -P OUTPUT DROP</w:t>
+            </w:r>
+          </w:p>
+          <w:p>
+            <w:pPr>
+              <w:pStyle w:val="Normal"/>
+              <w:widowControl/>
+              <w:suppressAutoHyphens w:val="true"/>
+              <w:spacing w:lineRule="auto" w:line="240" w:before="0" w:after="0"/>
+              <w:jc w:val="start"/>
+              <w:rPr>
+                <w:rFonts w:ascii="Consolas" w:hAnsi="Consolas"/>
+                <w:b w:val="false"/>
+                <w:bCs w:val="false"/>
+                <w:color w:val="FF0000"/>
+                <w:sz w:val="18"/>
+                <w:u w:val="none"/>
+              </w:rPr>
+            </w:pPr>
+            <w:r>
+              <w:rPr>
+                <w:rFonts w:ascii="Consolas" w:hAnsi="Consolas"/>
+                <w:b w:val="false"/>
+                <w:bCs w:val="false"/>
+                <w:color w:val="FF0000"/>
+                <w:sz w:val="18"/>
+                <w:u w:val="none"/>
+              </w:rPr>
+              <w:t>iptables -P FORWARD DROP</w:t>
             </w:r>
           </w:p>
         </w:tc>
@@ -9320,7 +10035,7 @@
                     <w:szCs w:val="22"/>
                     <w:lang w:val="es-ES" w:eastAsia="en-US" w:bidi="ar-SA"/>
                   </w:rPr>
-                  <w:t>☐</w:t>
+                  <w:t>x</w:t>
                 </w:r>
               </w:p>
             </w:sdtContent>
@@ -9341,20 +10056,79 @@
               <w:jc w:val="start"/>
               <w:rPr>
                 <w:rFonts w:ascii="Consolas" w:hAnsi="Consolas"/>
-                <w:b/>
-                <w:color w:val="FF0000"/>
-                <w:sz w:val="18"/>
-                <w:u w:val="single"/>
-              </w:rPr>
-            </w:pPr>
-            <w:r>
-              <w:rPr>
-                <w:rFonts w:ascii="Consolas" w:hAnsi="Consolas"/>
-                <w:b/>
-                <w:color w:val="FF0000"/>
-                <w:sz w:val="18"/>
-                <w:u w:val="single"/>
-              </w:rPr>
+                <w:b w:val="false"/>
+                <w:bCs w:val="false"/>
+                <w:color w:val="FF0000"/>
+                <w:sz w:val="18"/>
+                <w:u w:val="none"/>
+              </w:rPr>
+            </w:pPr>
+            <w:r>
+              <w:rPr>
+                <w:rFonts w:ascii="Consolas" w:hAnsi="Consolas"/>
+                <w:b w:val="false"/>
+                <w:bCs w:val="false"/>
+                <w:color w:val="FF0000"/>
+                <w:sz w:val="18"/>
+                <w:u w:val="none"/>
+              </w:rPr>
+              <w:t>Cumple con la política: Permitir acceder al servidor http (192.168.56.10) desde la LAN.</w:t>
+            </w:r>
+          </w:p>
+          <w:p>
+            <w:pPr>
+              <w:pStyle w:val="Normal"/>
+              <w:widowControl/>
+              <w:suppressAutoHyphens w:val="true"/>
+              <w:spacing w:lineRule="auto" w:line="240" w:before="0" w:after="0"/>
+              <w:jc w:val="start"/>
+              <w:rPr>
+                <w:rFonts w:ascii="Consolas" w:hAnsi="Consolas"/>
+                <w:b w:val="false"/>
+                <w:bCs w:val="false"/>
+                <w:color w:val="FF0000"/>
+                <w:sz w:val="18"/>
+                <w:u w:val="none"/>
+              </w:rPr>
+            </w:pPr>
+            <w:r>
+              <w:rPr>
+                <w:rFonts w:ascii="Consolas" w:hAnsi="Consolas"/>
+                <w:b w:val="false"/>
+                <w:bCs w:val="false"/>
+                <w:color w:val="FF0000"/>
+                <w:sz w:val="18"/>
+                <w:u w:val="none"/>
+              </w:rPr>
+              <w:t>iptables -A FORWARD -p tcp -s 192.168.56.10/24 --sport 80 -d 192.168.57.0/24 -j ACCEPT</w:t>
+            </w:r>
+          </w:p>
+          <w:p>
+            <w:pPr>
+              <w:pStyle w:val="Normal"/>
+              <w:widowControl/>
+              <w:suppressAutoHyphens w:val="true"/>
+              <w:spacing w:lineRule="auto" w:line="240" w:before="0" w:after="0"/>
+              <w:jc w:val="start"/>
+              <w:rPr>
+                <w:rFonts w:ascii="Consolas" w:hAnsi="Consolas"/>
+                <w:b w:val="false"/>
+                <w:bCs w:val="false"/>
+                <w:color w:val="FF0000"/>
+                <w:sz w:val="18"/>
+                <w:u w:val="none"/>
+              </w:rPr>
+            </w:pPr>
+            <w:r>
+              <w:rPr>
+                <w:rFonts w:ascii="Consolas" w:hAnsi="Consolas"/>
+                <w:b w:val="false"/>
+                <w:bCs w:val="false"/>
+                <w:color w:val="FF0000"/>
+                <w:sz w:val="18"/>
+                <w:u w:val="none"/>
+              </w:rPr>
+              <w:t>iptables -A FORWARD -p tcp -s 192.168.57.0/24 -d 192.168.56.10/24 --dport 80 -j ACCEPT</w:t>
             </w:r>
           </w:p>
         </w:tc>
@@ -9582,6 +10356,52 @@
                 <w:sz w:val="18"/>
                 <w:u w:val="single"/>
               </w:rPr>
+              <w:drawing>
+                <wp:anchor behindDoc="0" distT="0" distB="0" distL="0" distR="0" simplePos="0" locked="0" layoutInCell="0" allowOverlap="1" relativeHeight="11">
+                  <wp:simplePos x="0" y="0"/>
+                  <wp:positionH relativeFrom="column">
+                    <wp:posOffset>0</wp:posOffset>
+                  </wp:positionH>
+                  <wp:positionV relativeFrom="paragraph">
+                    <wp:posOffset>76835</wp:posOffset>
+                  </wp:positionV>
+                  <wp:extent cx="5587365" cy="2157095"/>
+                  <wp:effectExtent l="0" t="0" r="0" b="0"/>
+                  <wp:wrapSquare wrapText="largest"/>
+                  <wp:docPr id="10" name="Image10"/>
+                  <wp:cNvGraphicFramePr>
+                    <a:graphicFrameLocks xmlns:a="http://schemas.openxmlformats.org/drawingml/2006/main" noChangeAspect="1"/>
+                  </wp:cNvGraphicFramePr>
+                  <a:graphic xmlns:a="http://schemas.openxmlformats.org/drawingml/2006/main">
+                    <a:graphicData uri="http://schemas.openxmlformats.org/drawingml/2006/picture">
+                      <pic:pic xmlns:pic="http://schemas.openxmlformats.org/drawingml/2006/picture">
+                        <pic:nvPicPr>
+                          <pic:cNvPr id="10" name="Image10"/>
+                          <pic:cNvPicPr>
+                            <a:picLocks noChangeAspect="1" noChangeArrowheads="1"/>
+                          </pic:cNvPicPr>
+                        </pic:nvPicPr>
+                        <pic:blipFill>
+                          <a:blip r:embed="rId11"/>
+                          <a:stretch>
+                            <a:fillRect/>
+                          </a:stretch>
+                        </pic:blipFill>
+                        <pic:spPr bwMode="auto">
+                          <a:xfrm>
+                            <a:off x="0" y="0"/>
+                            <a:ext cx="5587365" cy="2157095"/>
+                          </a:xfrm>
+                          <a:prstGeom prst="rect">
+                            <a:avLst/>
+                          </a:prstGeom>
+                          <a:noFill/>
+                        </pic:spPr>
+                      </pic:pic>
+                    </a:graphicData>
+                  </a:graphic>
+                </wp:anchor>
+              </w:drawing>
             </w:r>
           </w:p>
           <w:p>
@@ -9801,19 +10621,269 @@
               <w:jc w:val="start"/>
               <w:rPr>
                 <w:rFonts w:ascii="Consolas" w:hAnsi="Consolas"/>
-                <w:b/>
-                <w:color w:val="FF0000"/>
-                <w:sz w:val="18"/>
-                <w:u w:val="single"/>
-              </w:rPr>
-            </w:pPr>
-            <w:r>
-              <w:rPr>
-                <w:rFonts w:ascii="Consolas" w:hAnsi="Consolas"/>
-                <w:b/>
-                <w:color w:val="FF0000"/>
-                <w:sz w:val="18"/>
-                <w:u w:val="single"/>
+                <w:b w:val="false"/>
+                <w:bCs w:val="false"/>
+                <w:color w:val="FF0000"/>
+                <w:sz w:val="18"/>
+                <w:u w:val="none"/>
+              </w:rPr>
+            </w:pPr>
+            <w:r>
+              <w:rPr>
+                <w:rFonts w:ascii="Consolas" w:hAnsi="Consolas"/>
+                <w:b w:val="false"/>
+                <w:bCs w:val="false"/>
+                <w:color w:val="FF0000"/>
+                <w:sz w:val="18"/>
+                <w:u w:val="none"/>
+              </w:rPr>
+              <w:t>Como podemos ver, hay un gran número de matches en las políticas por defecto, que incluyen todos los test icmp fallidos, así como los intentos de conexión http desde Kali a Win10 (debido al tiempo default de timeout, se reintenta la conexión hasta que pase dicho tiempo).</w:t>
+            </w:r>
+          </w:p>
+          <w:p>
+            <w:pPr>
+              <w:pStyle w:val="Normal"/>
+              <w:widowControl/>
+              <w:suppressAutoHyphens w:val="true"/>
+              <w:spacing w:lineRule="auto" w:line="240" w:before="0" w:after="0"/>
+              <w:jc w:val="start"/>
+              <w:rPr>
+                <w:rFonts w:ascii="Consolas" w:hAnsi="Consolas"/>
+                <w:b w:val="false"/>
+                <w:bCs w:val="false"/>
+                <w:color w:val="FF0000"/>
+                <w:sz w:val="18"/>
+                <w:u w:val="none"/>
+              </w:rPr>
+            </w:pPr>
+            <w:r>
+              <w:rPr>
+                <w:rFonts w:ascii="Consolas" w:hAnsi="Consolas"/>
+                <w:b w:val="false"/>
+                <w:bCs w:val="false"/>
+                <w:color w:val="FF0000"/>
+                <w:sz w:val="18"/>
+                <w:u w:val="none"/>
+              </w:rPr>
+            </w:r>
+          </w:p>
+          <w:p>
+            <w:pPr>
+              <w:pStyle w:val="Normal"/>
+              <w:widowControl/>
+              <w:suppressAutoHyphens w:val="true"/>
+              <w:spacing w:lineRule="auto" w:line="240" w:before="0" w:after="0"/>
+              <w:jc w:val="start"/>
+              <w:rPr>
+                <w:rFonts w:ascii="Consolas" w:hAnsi="Consolas"/>
+                <w:b w:val="false"/>
+                <w:bCs w:val="false"/>
+                <w:color w:val="FF0000"/>
+                <w:sz w:val="18"/>
+                <w:u w:val="none"/>
+              </w:rPr>
+            </w:pPr>
+            <w:r>
+              <w:rPr>
+                <w:rFonts w:ascii="Consolas" w:hAnsi="Consolas"/>
+                <w:b w:val="false"/>
+                <w:bCs w:val="false"/>
+                <w:color w:val="FF0000"/>
+                <w:sz w:val="18"/>
+                <w:u w:val="none"/>
+              </w:rPr>
+              <w:t>En el tráfico entrante, podemos observar que se han aceptado los paquetes ssh entrantes de WinXP, así como los pings de DMZ a Kali.</w:t>
+            </w:r>
+          </w:p>
+          <w:p>
+            <w:pPr>
+              <w:pStyle w:val="Normal"/>
+              <w:widowControl/>
+              <w:suppressAutoHyphens w:val="true"/>
+              <w:spacing w:lineRule="auto" w:line="240" w:before="0" w:after="0"/>
+              <w:jc w:val="start"/>
+              <w:rPr>
+                <w:rFonts w:ascii="Consolas" w:hAnsi="Consolas"/>
+                <w:b w:val="false"/>
+                <w:bCs w:val="false"/>
+                <w:color w:val="FF0000"/>
+                <w:sz w:val="18"/>
+                <w:u w:val="none"/>
+              </w:rPr>
+            </w:pPr>
+            <w:r>
+              <w:rPr>
+                <w:rFonts w:ascii="Consolas" w:hAnsi="Consolas"/>
+                <w:b w:val="false"/>
+                <w:bCs w:val="false"/>
+                <w:color w:val="FF0000"/>
+                <w:sz w:val="18"/>
+                <w:u w:val="none"/>
+              </w:rPr>
+            </w:r>
+          </w:p>
+          <w:p>
+            <w:pPr>
+              <w:pStyle w:val="Normal"/>
+              <w:widowControl/>
+              <w:suppressAutoHyphens w:val="true"/>
+              <w:spacing w:lineRule="auto" w:line="240" w:before="0" w:after="0"/>
+              <w:jc w:val="start"/>
+              <w:rPr>
+                <w:rFonts w:ascii="Consolas" w:hAnsi="Consolas"/>
+                <w:b w:val="false"/>
+                <w:bCs w:val="false"/>
+                <w:color w:val="FF0000"/>
+                <w:sz w:val="18"/>
+                <w:u w:val="none"/>
+              </w:rPr>
+            </w:pPr>
+            <w:r>
+              <w:rPr>
+                <w:rFonts w:ascii="Consolas" w:hAnsi="Consolas"/>
+                <w:b w:val="false"/>
+                <w:bCs w:val="false"/>
+                <w:color w:val="FF0000"/>
+                <w:sz w:val="18"/>
+                <w:u w:val="none"/>
+              </w:rPr>
+              <w:t>En el tráfico enrutado, observamos que se aceptan los pings de LAN a DMZ (dos primeras líneas), así como el intercambio de paquetes http entre Win10 y WinXP.</w:t>
+            </w:r>
+          </w:p>
+          <w:p>
+            <w:pPr>
+              <w:pStyle w:val="Normal"/>
+              <w:widowControl/>
+              <w:suppressAutoHyphens w:val="true"/>
+              <w:spacing w:lineRule="auto" w:line="240" w:before="0" w:after="0"/>
+              <w:jc w:val="start"/>
+              <w:rPr>
+                <w:rFonts w:ascii="Consolas" w:hAnsi="Consolas"/>
+                <w:b w:val="false"/>
+                <w:bCs w:val="false"/>
+                <w:color w:val="FF0000"/>
+                <w:sz w:val="18"/>
+                <w:u w:val="none"/>
+              </w:rPr>
+            </w:pPr>
+            <w:r>
+              <w:rPr>
+                <w:rFonts w:ascii="Consolas" w:hAnsi="Consolas"/>
+                <w:b w:val="false"/>
+                <w:bCs w:val="false"/>
+                <w:color w:val="FF0000"/>
+                <w:sz w:val="18"/>
+                <w:u w:val="none"/>
+              </w:rPr>
+            </w:r>
+          </w:p>
+          <w:p>
+            <w:pPr>
+              <w:pStyle w:val="Normal"/>
+              <w:widowControl/>
+              <w:suppressAutoHyphens w:val="true"/>
+              <w:spacing w:lineRule="auto" w:line="240" w:before="0" w:after="0"/>
+              <w:jc w:val="start"/>
+              <w:rPr>
+                <w:rFonts w:ascii="Consolas" w:hAnsi="Consolas"/>
+                <w:b w:val="false"/>
+                <w:bCs w:val="false"/>
+                <w:color w:val="FF0000"/>
+                <w:sz w:val="18"/>
+                <w:u w:val="none"/>
+              </w:rPr>
+            </w:pPr>
+            <w:r>
+              <w:rPr>
+                <w:rFonts w:ascii="Consolas" w:hAnsi="Consolas"/>
+                <w:b w:val="false"/>
+                <w:bCs w:val="false"/>
+                <w:color w:val="FF0000"/>
+                <w:sz w:val="18"/>
+                <w:u w:val="none"/>
+              </w:rPr>
+              <w:t>En el tráfico saliente, podemos observar que se aceptan los paquetes ssh a Win10, así como las respuestas a los pings de DMZ.</w:t>
+            </w:r>
+          </w:p>
+          <w:p>
+            <w:pPr>
+              <w:pStyle w:val="Normal"/>
+              <w:widowControl/>
+              <w:suppressAutoHyphens w:val="true"/>
+              <w:spacing w:lineRule="auto" w:line="240" w:before="0" w:after="0"/>
+              <w:jc w:val="start"/>
+              <w:rPr>
+                <w:rFonts w:ascii="Consolas" w:hAnsi="Consolas"/>
+                <w:b w:val="false"/>
+                <w:bCs w:val="false"/>
+                <w:color w:val="FF0000"/>
+                <w:sz w:val="18"/>
+                <w:u w:val="none"/>
+              </w:rPr>
+            </w:pPr>
+            <w:r>
+              <w:rPr>
+                <w:rFonts w:ascii="Consolas" w:hAnsi="Consolas"/>
+                <w:b w:val="false"/>
+                <w:bCs w:val="false"/>
+                <w:color w:val="FF0000"/>
+                <w:sz w:val="18"/>
+                <w:u w:val="none"/>
+              </w:rPr>
+            </w:r>
+          </w:p>
+          <w:p>
+            <w:pPr>
+              <w:pStyle w:val="Normal"/>
+              <w:widowControl/>
+              <w:suppressAutoHyphens w:val="true"/>
+              <w:spacing w:lineRule="auto" w:line="240" w:before="0" w:after="0"/>
+              <w:jc w:val="start"/>
+              <w:rPr>
+                <w:rFonts w:ascii="Consolas" w:hAnsi="Consolas"/>
+                <w:b w:val="false"/>
+                <w:bCs w:val="false"/>
+                <w:color w:val="FF0000"/>
+                <w:sz w:val="18"/>
+                <w:u w:val="none"/>
+              </w:rPr>
+            </w:pPr>
+            <w:r>
+              <w:rPr>
+                <w:rFonts w:ascii="Consolas" w:hAnsi="Consolas"/>
+                <w:b w:val="false"/>
+                <w:bCs w:val="false"/>
+                <w:color w:val="FF0000"/>
+                <w:sz w:val="18"/>
+                <w:u w:val="none"/>
+              </w:rPr>
+              <w:t>Esto muestra un correcto funcionamiento de la política de seguridad propuesta.</w:t>
+            </w:r>
+          </w:p>
+          <w:p>
+            <w:pPr>
+              <w:pStyle w:val="Normal"/>
+              <w:widowControl/>
+              <w:suppressAutoHyphens w:val="true"/>
+              <w:spacing w:lineRule="auto" w:line="240" w:before="0" w:after="0"/>
+              <w:jc w:val="start"/>
+              <w:rPr>
+                <w:rFonts w:ascii="Consolas" w:hAnsi="Consolas"/>
+                <w:b w:val="false"/>
+                <w:bCs w:val="false"/>
+                <w:color w:val="FF0000"/>
+                <w:sz w:val="18"/>
+                <w:u w:val="none"/>
+              </w:rPr>
+            </w:pPr>
+            <w:r>
+              <w:rPr>
+                <w:rFonts w:ascii="Consolas" w:hAnsi="Consolas"/>
+                <w:b w:val="false"/>
+                <w:bCs w:val="false"/>
+                <w:color w:val="FF0000"/>
+                <w:sz w:val="18"/>
+                <w:u w:val="none"/>
               </w:rPr>
             </w:r>
           </w:p>
@@ -10056,6 +11126,52 @@
                 <w:sz w:val="18"/>
                 <w:u w:val="single"/>
               </w:rPr>
+              <w:drawing>
+                <wp:anchor behindDoc="0" distT="0" distB="0" distL="0" distR="0" simplePos="0" locked="0" layoutInCell="0" allowOverlap="1" relativeHeight="12">
+                  <wp:simplePos x="0" y="0"/>
+                  <wp:positionH relativeFrom="column">
+                    <wp:align>center</wp:align>
+                  </wp:positionH>
+                  <wp:positionV relativeFrom="paragraph">
+                    <wp:posOffset>635</wp:posOffset>
+                  </wp:positionV>
+                  <wp:extent cx="4485640" cy="3034665"/>
+                  <wp:effectExtent l="0" t="0" r="0" b="0"/>
+                  <wp:wrapSquare wrapText="largest"/>
+                  <wp:docPr id="11" name="Image11"/>
+                  <wp:cNvGraphicFramePr>
+                    <a:graphicFrameLocks xmlns:a="http://schemas.openxmlformats.org/drawingml/2006/main" noChangeAspect="1"/>
+                  </wp:cNvGraphicFramePr>
+                  <a:graphic xmlns:a="http://schemas.openxmlformats.org/drawingml/2006/main">
+                    <a:graphicData uri="http://schemas.openxmlformats.org/drawingml/2006/picture">
+                      <pic:pic xmlns:pic="http://schemas.openxmlformats.org/drawingml/2006/picture">
+                        <pic:nvPicPr>
+                          <pic:cNvPr id="11" name="Image11"/>
+                          <pic:cNvPicPr>
+                            <a:picLocks noChangeAspect="1" noChangeArrowheads="1"/>
+                          </pic:cNvPicPr>
+                        </pic:nvPicPr>
+                        <pic:blipFill>
+                          <a:blip r:embed="rId12"/>
+                          <a:stretch>
+                            <a:fillRect/>
+                          </a:stretch>
+                        </pic:blipFill>
+                        <pic:spPr bwMode="auto">
+                          <a:xfrm>
+                            <a:off x="0" y="0"/>
+                            <a:ext cx="4485640" cy="3034665"/>
+                          </a:xfrm>
+                          <a:prstGeom prst="rect">
+                            <a:avLst/>
+                          </a:prstGeom>
+                          <a:noFill/>
+                        </pic:spPr>
+                      </pic:pic>
+                    </a:graphicData>
+                  </a:graphic>
+                </wp:anchor>
+              </w:drawing>
             </w:r>
           </w:p>
           <w:p>
@@ -10244,6 +11360,52 @@
                 <w:i/>
                 <w:sz w:val="16"/>
               </w:rPr>
+              <w:drawing>
+                <wp:anchor behindDoc="0" distT="0" distB="0" distL="0" distR="0" simplePos="0" locked="0" layoutInCell="0" allowOverlap="1" relativeHeight="13">
+                  <wp:simplePos x="0" y="0"/>
+                  <wp:positionH relativeFrom="column">
+                    <wp:align>center</wp:align>
+                  </wp:positionH>
+                  <wp:positionV relativeFrom="paragraph">
+                    <wp:posOffset>635</wp:posOffset>
+                  </wp:positionV>
+                  <wp:extent cx="4485640" cy="2272030"/>
+                  <wp:effectExtent l="0" t="0" r="0" b="0"/>
+                  <wp:wrapSquare wrapText="largest"/>
+                  <wp:docPr id="12" name="Image12"/>
+                  <wp:cNvGraphicFramePr>
+                    <a:graphicFrameLocks xmlns:a="http://schemas.openxmlformats.org/drawingml/2006/main" noChangeAspect="1"/>
+                  </wp:cNvGraphicFramePr>
+                  <a:graphic xmlns:a="http://schemas.openxmlformats.org/drawingml/2006/main">
+                    <a:graphicData uri="http://schemas.openxmlformats.org/drawingml/2006/picture">
+                      <pic:pic xmlns:pic="http://schemas.openxmlformats.org/drawingml/2006/picture">
+                        <pic:nvPicPr>
+                          <pic:cNvPr id="12" name="Image12"/>
+                          <pic:cNvPicPr>
+                            <a:picLocks noChangeAspect="1" noChangeArrowheads="1"/>
+                          </pic:cNvPicPr>
+                        </pic:nvPicPr>
+                        <pic:blipFill>
+                          <a:blip r:embed="rId13"/>
+                          <a:stretch>
+                            <a:fillRect/>
+                          </a:stretch>
+                        </pic:blipFill>
+                        <pic:spPr bwMode="auto">
+                          <a:xfrm>
+                            <a:off x="0" y="0"/>
+                            <a:ext cx="4485640" cy="2272030"/>
+                          </a:xfrm>
+                          <a:prstGeom prst="rect">
+                            <a:avLst/>
+                          </a:prstGeom>
+                          <a:noFill/>
+                        </pic:spPr>
+                      </pic:pic>
+                    </a:graphicData>
+                  </a:graphic>
+                </wp:anchor>
+              </w:drawing>
             </w:r>
           </w:p>
         </w:tc>
@@ -10390,6 +11552,52 @@
                 <w:sz w:val="18"/>
                 <w:u w:val="single"/>
               </w:rPr>
+              <w:drawing>
+                <wp:anchor behindDoc="0" distT="0" distB="0" distL="0" distR="0" simplePos="0" locked="0" layoutInCell="0" allowOverlap="1" relativeHeight="14">
+                  <wp:simplePos x="0" y="0"/>
+                  <wp:positionH relativeFrom="column">
+                    <wp:align>center</wp:align>
+                  </wp:positionH>
+                  <wp:positionV relativeFrom="paragraph">
+                    <wp:posOffset>635</wp:posOffset>
+                  </wp:positionV>
+                  <wp:extent cx="4485640" cy="2846070"/>
+                  <wp:effectExtent l="0" t="0" r="0" b="0"/>
+                  <wp:wrapSquare wrapText="largest"/>
+                  <wp:docPr id="13" name="Image13"/>
+                  <wp:cNvGraphicFramePr>
+                    <a:graphicFrameLocks xmlns:a="http://schemas.openxmlformats.org/drawingml/2006/main" noChangeAspect="1"/>
+                  </wp:cNvGraphicFramePr>
+                  <a:graphic xmlns:a="http://schemas.openxmlformats.org/drawingml/2006/main">
+                    <a:graphicData uri="http://schemas.openxmlformats.org/drawingml/2006/picture">
+                      <pic:pic xmlns:pic="http://schemas.openxmlformats.org/drawingml/2006/picture">
+                        <pic:nvPicPr>
+                          <pic:cNvPr id="13" name="Image13"/>
+                          <pic:cNvPicPr>
+                            <a:picLocks noChangeAspect="1" noChangeArrowheads="1"/>
+                          </pic:cNvPicPr>
+                        </pic:nvPicPr>
+                        <pic:blipFill>
+                          <a:blip r:embed="rId14"/>
+                          <a:stretch>
+                            <a:fillRect/>
+                          </a:stretch>
+                        </pic:blipFill>
+                        <pic:spPr bwMode="auto">
+                          <a:xfrm>
+                            <a:off x="0" y="0"/>
+                            <a:ext cx="4485640" cy="2846070"/>
+                          </a:xfrm>
+                          <a:prstGeom prst="rect">
+                            <a:avLst/>
+                          </a:prstGeom>
+                          <a:noFill/>
+                        </pic:spPr>
+                      </pic:pic>
+                    </a:graphicData>
+                  </a:graphic>
+                </wp:anchor>
+              </w:drawing>
             </w:r>
           </w:p>
           <w:p>
@@ -10580,6 +11788,52 @@
                 <w:i/>
                 <w:sz w:val="16"/>
               </w:rPr>
+              <w:drawing>
+                <wp:anchor behindDoc="0" distT="0" distB="0" distL="0" distR="0" simplePos="0" locked="0" layoutInCell="0" allowOverlap="1" relativeHeight="15">
+                  <wp:simplePos x="0" y="0"/>
+                  <wp:positionH relativeFrom="column">
+                    <wp:align>center</wp:align>
+                  </wp:positionH>
+                  <wp:positionV relativeFrom="paragraph">
+                    <wp:posOffset>635</wp:posOffset>
+                  </wp:positionV>
+                  <wp:extent cx="4485640" cy="3373755"/>
+                  <wp:effectExtent l="0" t="0" r="0" b="0"/>
+                  <wp:wrapSquare wrapText="largest"/>
+                  <wp:docPr id="14" name="Image14"/>
+                  <wp:cNvGraphicFramePr>
+                    <a:graphicFrameLocks xmlns:a="http://schemas.openxmlformats.org/drawingml/2006/main" noChangeAspect="1"/>
+                  </wp:cNvGraphicFramePr>
+                  <a:graphic xmlns:a="http://schemas.openxmlformats.org/drawingml/2006/main">
+                    <a:graphicData uri="http://schemas.openxmlformats.org/drawingml/2006/picture">
+                      <pic:pic xmlns:pic="http://schemas.openxmlformats.org/drawingml/2006/picture">
+                        <pic:nvPicPr>
+                          <pic:cNvPr id="14" name="Image14"/>
+                          <pic:cNvPicPr>
+                            <a:picLocks noChangeAspect="1" noChangeArrowheads="1"/>
+                          </pic:cNvPicPr>
+                        </pic:nvPicPr>
+                        <pic:blipFill>
+                          <a:blip r:embed="rId15"/>
+                          <a:stretch>
+                            <a:fillRect/>
+                          </a:stretch>
+                        </pic:blipFill>
+                        <pic:spPr bwMode="auto">
+                          <a:xfrm>
+                            <a:off x="0" y="0"/>
+                            <a:ext cx="4485640" cy="3373755"/>
+                          </a:xfrm>
+                          <a:prstGeom prst="rect">
+                            <a:avLst/>
+                          </a:prstGeom>
+                          <a:noFill/>
+                        </pic:spPr>
+                      </pic:pic>
+                    </a:graphicData>
+                  </a:graphic>
+                </wp:anchor>
+              </w:drawing>
             </w:r>
           </w:p>
         </w:tc>
@@ -14316,12 +15570,12 @@
       </w:r>
     </w:p>
     <w:sectPr>
-      <w:headerReference w:type="even" r:id="rId11"/>
-      <w:headerReference w:type="default" r:id="rId12"/>
-      <w:headerReference w:type="first" r:id="rId13"/>
-      <w:footerReference w:type="even" r:id="rId14"/>
-      <w:footerReference w:type="default" r:id="rId15"/>
-      <w:footerReference w:type="first" r:id="rId16"/>
+      <w:headerReference w:type="even" r:id="rId16"/>
+      <w:headerReference w:type="default" r:id="rId17"/>
+      <w:headerReference w:type="first" r:id="rId18"/>
+      <w:footerReference w:type="even" r:id="rId19"/>
+      <w:footerReference w:type="default" r:id="rId20"/>
+      <w:footerReference w:type="first" r:id="rId21"/>
       <w:footnotePr>
         <w:numFmt w:val="decimal"/>
       </w:footnotePr>
@@ -14382,7 +15636,7 @@
         </w:r>
         <w:r>
           <w:rPr/>
-          <w:t>12</w:t>
+          <w:t>14</w:t>
         </w:r>
         <w:r>
           <w:rPr/>
@@ -14425,7 +15679,7 @@
         </w:r>
         <w:r>
           <w:rPr/>
-          <w:t>12</w:t>
+          <w:t>14</w:t>
         </w:r>
         <w:r>
           <w:rPr/>
@@ -16171,8 +17425,8 @@
       <w:szCs w:val="20"/>
     </w:rPr>
   </w:style>
-  <w:style w:type="character" w:styleId="FootnoteCharactersuser">
-    <w:name w:val="Footnote Characters (user)"/>
+  <w:style w:type="character" w:styleId="FootnoteCharacters">
+    <w:name w:val="Footnote Characters"/>
     <w:uiPriority w:val="99"/>
     <w:semiHidden/>
     <w:unhideWhenUsed/>
@@ -16182,8 +17436,8 @@
       <w:vertAlign w:val="superscript"/>
     </w:rPr>
   </w:style>
-  <w:style w:type="character" w:styleId="FootnoteCharacters">
-    <w:name w:val="Footnote Characters"/>
+  <w:style w:type="character" w:styleId="FootnoteCharactersuser">
+    <w:name w:val="Footnote Characters (user)"/>
     <w:qFormat/>
     <w:rPr>
       <w:vertAlign w:val="superscript"/>
@@ -16280,17 +17534,19 @@
     <w:rsid w:val="007f1fb0"/>
     <w:rPr/>
   </w:style>
+  <w:style w:type="character" w:styleId="EndnoteCharactersuser">
+    <w:name w:val="Endnote Characters (user)"/>
+    <w:qFormat/>
+    <w:rPr>
+      <w:vertAlign w:val="superscript"/>
+    </w:rPr>
+  </w:style>
   <w:style w:type="character" w:styleId="EndnoteCharacters">
     <w:name w:val="Endnote Characters"/>
     <w:qFormat/>
     <w:rPr>
       <w:vertAlign w:val="superscript"/>
     </w:rPr>
-  </w:style>
-  <w:style w:type="character" w:styleId="EndnoteCharactersuser">
-    <w:name w:val="Endnote Characters (user)"/>
-    <w:qFormat/>
-    <w:rPr/>
   </w:style>
   <w:style w:type="character" w:styleId="EndnoteReference">
     <w:name w:val="endnote reference"/>

</xml_diff>